<commit_message>
Fix hosted-DB auto-reconnect; add live link + screenshot to README
</commit_message>
<xml_diff>
--- a/docs/BOM-Track_Review1.docx
+++ b/docs/BOM-Track_Review1.docx
@@ -230,32 +230,6 @@
     </w:tbl>
     <w:p/>
     <w:p/>
-    <w:p>
-      <w:pPr>
-        <w:jc w:val="center"/>
-      </w:pPr>
-      <w:r>
-        <w:t>14</w:t>
-      </w:r>
-      <w:r>
-        <w:rPr>
-          <w:vertAlign w:val="superscript"/>
-        </w:rPr>
-        <w:t>th</w:t>
-      </w:r>
-      <w:r>
-        <w:t xml:space="preserve"> </w:t>
-      </w:r>
-      <w:r>
-        <w:t>October</w:t>
-      </w:r>
-      <w:r>
-        <w:t>,</w:t>
-      </w:r>
-      <w:r>
-        <w:t xml:space="preserve"> 2026</w:t>
-      </w:r>
-    </w:p>
     <w:p>
       <w:r>
         <w:br w:type="page"/>
@@ -396,8 +370,6 @@
       </w:pPr>
       <w:r>
         <w:br/>
-      </w:r>
-      <w:r>
         <w:t xml:space="preserve">Right </w:t>
       </w:r>
       <w:r>
@@ -530,7 +502,7 @@
           </w:tcPr>
           <w:p>
             <w:pPr>
-              <w:spacing w:after="20" w:line="240" w:lineRule="auto"/>
+              <w:spacing w:after="20"/>
             </w:pPr>
             <w:r>
               <w:rPr>
@@ -548,7 +520,7 @@
           </w:tcPr>
           <w:p>
             <w:pPr>
-              <w:spacing w:after="20" w:line="240" w:lineRule="auto"/>
+              <w:spacing w:after="20"/>
             </w:pPr>
             <w:r>
               <w:rPr>
@@ -570,7 +542,7 @@
           </w:tcPr>
           <w:p>
             <w:pPr>
-              <w:spacing w:after="20" w:line="240" w:lineRule="auto"/>
+              <w:spacing w:after="20"/>
             </w:pPr>
             <w:r>
               <w:rPr>
@@ -586,7 +558,7 @@
           </w:tcPr>
           <w:p>
             <w:pPr>
-              <w:spacing w:after="20" w:line="240" w:lineRule="auto"/>
+              <w:spacing w:after="20"/>
             </w:pPr>
             <w:r>
               <w:rPr>
@@ -607,7 +579,7 @@
           </w:tcPr>
           <w:p>
             <w:pPr>
-              <w:spacing w:after="20" w:line="240" w:lineRule="auto"/>
+              <w:spacing w:after="20"/>
             </w:pPr>
             <w:r>
               <w:rPr>
@@ -623,7 +595,7 @@
           </w:tcPr>
           <w:p>
             <w:pPr>
-              <w:spacing w:after="20" w:line="240" w:lineRule="auto"/>
+              <w:spacing w:after="20"/>
             </w:pPr>
             <w:r>
               <w:rPr>
@@ -644,7 +616,7 @@
           </w:tcPr>
           <w:p>
             <w:pPr>
-              <w:spacing w:after="20" w:line="240" w:lineRule="auto"/>
+              <w:spacing w:after="20"/>
             </w:pPr>
             <w:r>
               <w:rPr>
@@ -660,7 +632,7 @@
           </w:tcPr>
           <w:p>
             <w:pPr>
-              <w:spacing w:after="20" w:line="240" w:lineRule="auto"/>
+              <w:spacing w:after="20"/>
             </w:pPr>
             <w:r>
               <w:rPr>
@@ -708,7 +680,7 @@
           </w:tcPr>
           <w:p>
             <w:pPr>
-              <w:spacing w:after="20" w:line="240" w:lineRule="auto"/>
+              <w:spacing w:after="20"/>
             </w:pPr>
             <w:r>
               <w:rPr>
@@ -726,7 +698,7 @@
           </w:tcPr>
           <w:p>
             <w:pPr>
-              <w:spacing w:after="20" w:line="240" w:lineRule="auto"/>
+              <w:spacing w:after="20"/>
             </w:pPr>
             <w:r>
               <w:rPr>
@@ -748,7 +720,7 @@
           </w:tcPr>
           <w:p>
             <w:pPr>
-              <w:spacing w:after="20" w:line="240" w:lineRule="auto"/>
+              <w:spacing w:after="20"/>
             </w:pPr>
             <w:r>
               <w:rPr>
@@ -764,7 +736,7 @@
           </w:tcPr>
           <w:p>
             <w:pPr>
-              <w:spacing w:after="20" w:line="240" w:lineRule="auto"/>
+              <w:spacing w:after="20"/>
             </w:pPr>
             <w:r>
               <w:rPr>
@@ -785,7 +757,7 @@
           </w:tcPr>
           <w:p>
             <w:pPr>
-              <w:spacing w:after="20" w:line="240" w:lineRule="auto"/>
+              <w:spacing w:after="20"/>
             </w:pPr>
             <w:r>
               <w:rPr>
@@ -801,7 +773,7 @@
           </w:tcPr>
           <w:p>
             <w:pPr>
-              <w:spacing w:after="20" w:line="240" w:lineRule="auto"/>
+              <w:spacing w:after="20"/>
             </w:pPr>
             <w:r>
               <w:rPr>
@@ -822,7 +794,7 @@
           </w:tcPr>
           <w:p>
             <w:pPr>
-              <w:spacing w:after="20" w:line="240" w:lineRule="auto"/>
+              <w:spacing w:after="20"/>
             </w:pPr>
             <w:r>
               <w:rPr>
@@ -838,7 +810,7 @@
           </w:tcPr>
           <w:p>
             <w:pPr>
-              <w:spacing w:after="20" w:line="240" w:lineRule="auto"/>
+              <w:spacing w:after="20"/>
             </w:pPr>
             <w:r>
               <w:rPr>
@@ -859,7 +831,7 @@
           </w:tcPr>
           <w:p>
             <w:pPr>
-              <w:spacing w:after="20" w:line="240" w:lineRule="auto"/>
+              <w:spacing w:after="20"/>
             </w:pPr>
             <w:r>
               <w:rPr>
@@ -875,7 +847,7 @@
           </w:tcPr>
           <w:p>
             <w:pPr>
-              <w:spacing w:after="20" w:line="240" w:lineRule="auto"/>
+              <w:spacing w:after="20"/>
             </w:pPr>
             <w:r>
               <w:rPr>
@@ -896,7 +868,7 @@
           </w:tcPr>
           <w:p>
             <w:pPr>
-              <w:spacing w:after="20" w:line="240" w:lineRule="auto"/>
+              <w:spacing w:after="20"/>
             </w:pPr>
             <w:r>
               <w:rPr>
@@ -912,7 +884,7 @@
           </w:tcPr>
           <w:p>
             <w:pPr>
-              <w:spacing w:after="20" w:line="240" w:lineRule="auto"/>
+              <w:spacing w:after="20"/>
             </w:pPr>
             <w:r>
               <w:rPr>
@@ -933,7 +905,7 @@
           </w:tcPr>
           <w:p>
             <w:pPr>
-              <w:spacing w:after="20" w:line="240" w:lineRule="auto"/>
+              <w:spacing w:after="20"/>
             </w:pPr>
             <w:r>
               <w:rPr>
@@ -949,7 +921,7 @@
           </w:tcPr>
           <w:p>
             <w:pPr>
-              <w:spacing w:after="20" w:line="240" w:lineRule="auto"/>
+              <w:spacing w:after="20"/>
             </w:pPr>
           </w:p>
         </w:tc>
@@ -1009,7 +981,7 @@
           </w:tcPr>
           <w:p>
             <w:pPr>
-              <w:spacing w:after="20" w:line="240" w:lineRule="auto"/>
+              <w:spacing w:after="20"/>
             </w:pPr>
             <w:r>
               <w:rPr>
@@ -1027,7 +999,7 @@
           </w:tcPr>
           <w:p>
             <w:pPr>
-              <w:spacing w:after="20" w:line="240" w:lineRule="auto"/>
+              <w:spacing w:after="20"/>
             </w:pPr>
             <w:r>
               <w:rPr>
@@ -1045,7 +1017,7 @@
           </w:tcPr>
           <w:p>
             <w:pPr>
-              <w:spacing w:after="20" w:line="240" w:lineRule="auto"/>
+              <w:spacing w:after="20"/>
             </w:pPr>
             <w:r>
               <w:rPr>
@@ -1063,7 +1035,7 @@
           </w:tcPr>
           <w:p>
             <w:pPr>
-              <w:spacing w:after="20" w:line="240" w:lineRule="auto"/>
+              <w:spacing w:after="20"/>
             </w:pPr>
             <w:r>
               <w:rPr>
@@ -1085,7 +1057,7 @@
           </w:tcPr>
           <w:p>
             <w:pPr>
-              <w:spacing w:after="20" w:line="240" w:lineRule="auto"/>
+              <w:spacing w:after="20"/>
             </w:pPr>
             <w:r>
               <w:rPr>
@@ -1102,7 +1074,7 @@
           </w:tcPr>
           <w:p>
             <w:pPr>
-              <w:spacing w:after="20" w:line="240" w:lineRule="auto"/>
+              <w:spacing w:after="20"/>
             </w:pPr>
             <w:r>
               <w:rPr>
@@ -1118,7 +1090,7 @@
           </w:tcPr>
           <w:p>
             <w:pPr>
-              <w:spacing w:after="20" w:line="240" w:lineRule="auto"/>
+              <w:spacing w:after="20"/>
             </w:pPr>
             <w:r>
               <w:rPr>
@@ -1135,7 +1107,7 @@
           </w:tcPr>
           <w:p>
             <w:pPr>
-              <w:spacing w:after="20" w:line="240" w:lineRule="auto"/>
+              <w:spacing w:after="20"/>
             </w:pPr>
             <w:r>
               <w:rPr>
@@ -1156,7 +1128,7 @@
           </w:tcPr>
           <w:p>
             <w:pPr>
-              <w:spacing w:after="20" w:line="240" w:lineRule="auto"/>
+              <w:spacing w:after="20"/>
             </w:pPr>
             <w:r>
               <w:rPr>
@@ -1173,7 +1145,7 @@
           </w:tcPr>
           <w:p>
             <w:pPr>
-              <w:spacing w:after="20" w:line="240" w:lineRule="auto"/>
+              <w:spacing w:after="20"/>
             </w:pPr>
             <w:r>
               <w:rPr>
@@ -1189,7 +1161,7 @@
           </w:tcPr>
           <w:p>
             <w:pPr>
-              <w:spacing w:after="20" w:line="240" w:lineRule="auto"/>
+              <w:spacing w:after="20"/>
             </w:pPr>
             <w:r>
               <w:rPr>
@@ -1206,7 +1178,7 @@
           </w:tcPr>
           <w:p>
             <w:pPr>
-              <w:spacing w:after="20" w:line="240" w:lineRule="auto"/>
+              <w:spacing w:after="20"/>
             </w:pPr>
             <w:r>
               <w:rPr>
@@ -1227,7 +1199,7 @@
           </w:tcPr>
           <w:p>
             <w:pPr>
-              <w:spacing w:after="20" w:line="240" w:lineRule="auto"/>
+              <w:spacing w:after="20"/>
             </w:pPr>
             <w:r>
               <w:rPr>
@@ -1244,7 +1216,7 @@
           </w:tcPr>
           <w:p>
             <w:pPr>
-              <w:spacing w:after="20" w:line="240" w:lineRule="auto"/>
+              <w:spacing w:after="20"/>
             </w:pPr>
             <w:r>
               <w:rPr>
@@ -1260,7 +1232,7 @@
           </w:tcPr>
           <w:p>
             <w:pPr>
-              <w:spacing w:after="20" w:line="240" w:lineRule="auto"/>
+              <w:spacing w:after="20"/>
             </w:pPr>
             <w:r>
               <w:rPr>
@@ -1277,7 +1249,7 @@
           </w:tcPr>
           <w:p>
             <w:pPr>
-              <w:spacing w:after="20" w:line="240" w:lineRule="auto"/>
+              <w:spacing w:after="20"/>
             </w:pPr>
             <w:r>
               <w:rPr>
@@ -1298,7 +1270,7 @@
           </w:tcPr>
           <w:p>
             <w:pPr>
-              <w:spacing w:after="20" w:line="240" w:lineRule="auto"/>
+              <w:spacing w:after="20"/>
             </w:pPr>
             <w:r>
               <w:rPr>
@@ -1315,7 +1287,7 @@
           </w:tcPr>
           <w:p>
             <w:pPr>
-              <w:spacing w:after="20" w:line="240" w:lineRule="auto"/>
+              <w:spacing w:after="20"/>
             </w:pPr>
             <w:r>
               <w:rPr>
@@ -1331,7 +1303,7 @@
           </w:tcPr>
           <w:p>
             <w:pPr>
-              <w:spacing w:after="20" w:line="240" w:lineRule="auto"/>
+              <w:spacing w:after="20"/>
             </w:pPr>
             <w:r>
               <w:rPr>
@@ -1348,7 +1320,7 @@
           </w:tcPr>
           <w:p>
             <w:pPr>
-              <w:spacing w:after="20" w:line="240" w:lineRule="auto"/>
+              <w:spacing w:after="20"/>
             </w:pPr>
             <w:r>
               <w:rPr>
@@ -1369,7 +1341,7 @@
           </w:tcPr>
           <w:p>
             <w:pPr>
-              <w:spacing w:after="20" w:line="240" w:lineRule="auto"/>
+              <w:spacing w:after="20"/>
             </w:pPr>
             <w:r>
               <w:rPr>
@@ -1386,7 +1358,7 @@
           </w:tcPr>
           <w:p>
             <w:pPr>
-              <w:spacing w:after="20" w:line="240" w:lineRule="auto"/>
+              <w:spacing w:after="20"/>
             </w:pPr>
             <w:r>
               <w:rPr>
@@ -1402,7 +1374,7 @@
           </w:tcPr>
           <w:p>
             <w:pPr>
-              <w:spacing w:after="20" w:line="240" w:lineRule="auto"/>
+              <w:spacing w:after="20"/>
             </w:pPr>
             <w:r>
               <w:rPr>
@@ -1419,7 +1391,7 @@
           </w:tcPr>
           <w:p>
             <w:pPr>
-              <w:spacing w:after="20" w:line="240" w:lineRule="auto"/>
+              <w:spacing w:after="20"/>
             </w:pPr>
             <w:r>
               <w:rPr>
@@ -1440,7 +1412,7 @@
           </w:tcPr>
           <w:p>
             <w:pPr>
-              <w:spacing w:after="20" w:line="240" w:lineRule="auto"/>
+              <w:spacing w:after="20"/>
             </w:pPr>
             <w:r>
               <w:rPr>
@@ -1457,7 +1429,7 @@
           </w:tcPr>
           <w:p>
             <w:pPr>
-              <w:spacing w:after="20" w:line="240" w:lineRule="auto"/>
+              <w:spacing w:after="20"/>
             </w:pPr>
             <w:r>
               <w:rPr>
@@ -1473,7 +1445,7 @@
           </w:tcPr>
           <w:p>
             <w:pPr>
-              <w:spacing w:after="20" w:line="240" w:lineRule="auto"/>
+              <w:spacing w:after="20"/>
             </w:pPr>
             <w:r>
               <w:rPr>
@@ -1490,7 +1462,7 @@
           </w:tcPr>
           <w:p>
             <w:pPr>
-              <w:spacing w:after="20" w:line="240" w:lineRule="auto"/>
+              <w:spacing w:after="20"/>
             </w:pPr>
             <w:r>
               <w:rPr>
@@ -1550,7 +1522,7 @@
           </w:tcPr>
           <w:p>
             <w:pPr>
-              <w:spacing w:after="20" w:line="240" w:lineRule="auto"/>
+              <w:spacing w:after="20"/>
             </w:pPr>
             <w:r>
               <w:rPr>
@@ -1568,7 +1540,7 @@
           </w:tcPr>
           <w:p>
             <w:pPr>
-              <w:spacing w:after="20" w:line="240" w:lineRule="auto"/>
+              <w:spacing w:after="20"/>
             </w:pPr>
             <w:r>
               <w:rPr>
@@ -1590,7 +1562,7 @@
           </w:tcPr>
           <w:p>
             <w:pPr>
-              <w:spacing w:after="20" w:line="240" w:lineRule="auto"/>
+              <w:spacing w:after="20"/>
             </w:pPr>
             <w:r>
               <w:rPr>
@@ -1606,7 +1578,7 @@
           </w:tcPr>
           <w:p>
             <w:pPr>
-              <w:spacing w:after="20" w:line="240" w:lineRule="auto"/>
+              <w:spacing w:after="20"/>
             </w:pPr>
             <w:r>
               <w:rPr>
@@ -1627,7 +1599,7 @@
           </w:tcPr>
           <w:p>
             <w:pPr>
-              <w:spacing w:after="20" w:line="240" w:lineRule="auto"/>
+              <w:spacing w:after="20"/>
             </w:pPr>
             <w:r>
               <w:rPr>
@@ -1643,7 +1615,7 @@
           </w:tcPr>
           <w:p>
             <w:pPr>
-              <w:spacing w:after="20" w:line="240" w:lineRule="auto"/>
+              <w:spacing w:after="20"/>
             </w:pPr>
             <w:r>
               <w:rPr>
@@ -1664,7 +1636,7 @@
           </w:tcPr>
           <w:p>
             <w:pPr>
-              <w:spacing w:after="20" w:line="240" w:lineRule="auto"/>
+              <w:spacing w:after="20"/>
             </w:pPr>
             <w:r>
               <w:rPr>
@@ -1680,7 +1652,7 @@
           </w:tcPr>
           <w:p>
             <w:pPr>
-              <w:spacing w:after="20" w:line="240" w:lineRule="auto"/>
+              <w:spacing w:after="20"/>
             </w:pPr>
             <w:r>
               <w:rPr>
@@ -1701,7 +1673,7 @@
           </w:tcPr>
           <w:p>
             <w:pPr>
-              <w:spacing w:after="20" w:line="240" w:lineRule="auto"/>
+              <w:spacing w:after="20"/>
             </w:pPr>
             <w:r>
               <w:rPr>
@@ -1717,7 +1689,7 @@
           </w:tcPr>
           <w:p>
             <w:pPr>
-              <w:spacing w:after="20" w:line="240" w:lineRule="auto"/>
+              <w:spacing w:after="20"/>
             </w:pPr>
             <w:r>
               <w:rPr>
@@ -1738,7 +1710,7 @@
           </w:tcPr>
           <w:p>
             <w:pPr>
-              <w:spacing w:after="20" w:line="240" w:lineRule="auto"/>
+              <w:spacing w:after="20"/>
             </w:pPr>
             <w:r>
               <w:rPr>
@@ -1754,7 +1726,7 @@
           </w:tcPr>
           <w:p>
             <w:pPr>
-              <w:spacing w:after="20" w:line="240" w:lineRule="auto"/>
+              <w:spacing w:after="20"/>
             </w:pPr>
             <w:r>
               <w:rPr>
@@ -1775,7 +1747,7 @@
           </w:tcPr>
           <w:p>
             <w:pPr>
-              <w:spacing w:after="20" w:line="240" w:lineRule="auto"/>
+              <w:spacing w:after="20"/>
             </w:pPr>
             <w:r>
               <w:rPr>
@@ -1791,7 +1763,7 @@
           </w:tcPr>
           <w:p>
             <w:pPr>
-              <w:spacing w:after="20" w:line="240" w:lineRule="auto"/>
+              <w:spacing w:after="20"/>
             </w:pPr>
             <w:r>
               <w:rPr>
@@ -1812,7 +1784,7 @@
           </w:tcPr>
           <w:p>
             <w:pPr>
-              <w:spacing w:after="20" w:line="240" w:lineRule="auto"/>
+              <w:spacing w:after="20"/>
             </w:pPr>
             <w:r>
               <w:rPr>
@@ -1828,7 +1800,7 @@
           </w:tcPr>
           <w:p>
             <w:pPr>
-              <w:spacing w:after="20" w:line="240" w:lineRule="auto"/>
+              <w:spacing w:after="20"/>
             </w:pPr>
             <w:r>
               <w:rPr>
@@ -1849,7 +1821,7 @@
           </w:tcPr>
           <w:p>
             <w:pPr>
-              <w:spacing w:after="20" w:line="240" w:lineRule="auto"/>
+              <w:spacing w:after="20"/>
             </w:pPr>
             <w:r>
               <w:rPr>
@@ -1865,7 +1837,7 @@
           </w:tcPr>
           <w:p>
             <w:pPr>
-              <w:spacing w:after="20" w:line="240" w:lineRule="auto"/>
+              <w:spacing w:after="20"/>
             </w:pPr>
             <w:r>
               <w:rPr>
@@ -1914,7 +1886,7 @@
           </w:tcPr>
           <w:p>
             <w:pPr>
-              <w:spacing w:after="20" w:line="240" w:lineRule="auto"/>
+              <w:spacing w:after="20"/>
             </w:pPr>
             <w:r>
               <w:rPr>
@@ -1932,7 +1904,7 @@
           </w:tcPr>
           <w:p>
             <w:pPr>
-              <w:spacing w:after="20" w:line="240" w:lineRule="auto"/>
+              <w:spacing w:after="20"/>
             </w:pPr>
             <w:r>
               <w:rPr>
@@ -1950,7 +1922,7 @@
           </w:tcPr>
           <w:p>
             <w:pPr>
-              <w:spacing w:after="20" w:line="240" w:lineRule="auto"/>
+              <w:spacing w:after="20"/>
             </w:pPr>
             <w:r>
               <w:rPr>
@@ -1972,7 +1944,7 @@
           </w:tcPr>
           <w:p>
             <w:pPr>
-              <w:spacing w:after="20" w:line="240" w:lineRule="auto"/>
+              <w:spacing w:after="20"/>
             </w:pPr>
             <w:r>
               <w:rPr>
@@ -1988,7 +1960,7 @@
           </w:tcPr>
           <w:p>
             <w:pPr>
-              <w:spacing w:after="20" w:line="240" w:lineRule="auto"/>
+              <w:spacing w:after="20"/>
             </w:pPr>
             <w:r>
               <w:rPr>
@@ -2004,7 +1976,7 @@
           </w:tcPr>
           <w:p>
             <w:pPr>
-              <w:spacing w:after="20" w:line="240" w:lineRule="auto"/>
+              <w:spacing w:after="20"/>
             </w:pPr>
             <w:r>
               <w:rPr>
@@ -2025,7 +1997,7 @@
           </w:tcPr>
           <w:p>
             <w:pPr>
-              <w:spacing w:after="20" w:line="240" w:lineRule="auto"/>
+              <w:spacing w:after="20"/>
             </w:pPr>
             <w:r>
               <w:rPr>
@@ -2041,7 +2013,7 @@
           </w:tcPr>
           <w:p>
             <w:pPr>
-              <w:spacing w:after="20" w:line="240" w:lineRule="auto"/>
+              <w:spacing w:after="20"/>
             </w:pPr>
             <w:r>
               <w:rPr>
@@ -2057,7 +2029,7 @@
           </w:tcPr>
           <w:p>
             <w:pPr>
-              <w:spacing w:after="20" w:line="240" w:lineRule="auto"/>
+              <w:spacing w:after="20"/>
             </w:pPr>
             <w:r>
               <w:rPr>
@@ -2078,7 +2050,7 @@
           </w:tcPr>
           <w:p>
             <w:pPr>
-              <w:spacing w:after="20" w:line="240" w:lineRule="auto"/>
+              <w:spacing w:after="20"/>
             </w:pPr>
             <w:r>
               <w:rPr>
@@ -2094,7 +2066,7 @@
           </w:tcPr>
           <w:p>
             <w:pPr>
-              <w:spacing w:after="20" w:line="240" w:lineRule="auto"/>
+              <w:spacing w:after="20"/>
             </w:pPr>
             <w:r>
               <w:rPr>
@@ -2110,7 +2082,7 @@
           </w:tcPr>
           <w:p>
             <w:pPr>
-              <w:spacing w:after="20" w:line="240" w:lineRule="auto"/>
+              <w:spacing w:after="20"/>
             </w:pPr>
             <w:r>
               <w:rPr>
@@ -2131,7 +2103,7 @@
           </w:tcPr>
           <w:p>
             <w:pPr>
-              <w:spacing w:after="20" w:line="240" w:lineRule="auto"/>
+              <w:spacing w:after="20"/>
             </w:pPr>
             <w:r>
               <w:rPr>
@@ -2147,7 +2119,7 @@
           </w:tcPr>
           <w:p>
             <w:pPr>
-              <w:spacing w:after="20" w:line="240" w:lineRule="auto"/>
+              <w:spacing w:after="20"/>
             </w:pPr>
             <w:r>
               <w:rPr>
@@ -2163,7 +2135,7 @@
           </w:tcPr>
           <w:p>
             <w:pPr>
-              <w:spacing w:after="20" w:line="240" w:lineRule="auto"/>
+              <w:spacing w:after="20"/>
             </w:pPr>
             <w:r>
               <w:rPr>
@@ -2184,7 +2156,7 @@
           </w:tcPr>
           <w:p>
             <w:pPr>
-              <w:spacing w:after="20" w:line="240" w:lineRule="auto"/>
+              <w:spacing w:after="20"/>
             </w:pPr>
             <w:r>
               <w:rPr>
@@ -2200,7 +2172,7 @@
           </w:tcPr>
           <w:p>
             <w:pPr>
-              <w:spacing w:after="20" w:line="240" w:lineRule="auto"/>
+              <w:spacing w:after="20"/>
             </w:pPr>
             <w:r>
               <w:rPr>
@@ -2216,7 +2188,7 @@
           </w:tcPr>
           <w:p>
             <w:pPr>
-              <w:spacing w:after="20" w:line="240" w:lineRule="auto"/>
+              <w:spacing w:after="20"/>
             </w:pPr>
             <w:r>
               <w:rPr>
@@ -2237,7 +2209,7 @@
           </w:tcPr>
           <w:p>
             <w:pPr>
-              <w:spacing w:after="20" w:line="240" w:lineRule="auto"/>
+              <w:spacing w:after="20"/>
             </w:pPr>
             <w:r>
               <w:rPr>
@@ -2253,7 +2225,7 @@
           </w:tcPr>
           <w:p>
             <w:pPr>
-              <w:spacing w:after="20" w:line="240" w:lineRule="auto"/>
+              <w:spacing w:after="20"/>
             </w:pPr>
             <w:r>
               <w:rPr>
@@ -2269,7 +2241,7 @@
           </w:tcPr>
           <w:p>
             <w:pPr>
-              <w:spacing w:after="20" w:line="240" w:lineRule="auto"/>
+              <w:spacing w:after="20"/>
             </w:pPr>
             <w:r>
               <w:rPr>
@@ -2290,7 +2262,7 @@
           </w:tcPr>
           <w:p>
             <w:pPr>
-              <w:spacing w:after="20" w:line="240" w:lineRule="auto"/>
+              <w:spacing w:after="20"/>
             </w:pPr>
             <w:r>
               <w:rPr>
@@ -2306,7 +2278,7 @@
           </w:tcPr>
           <w:p>
             <w:pPr>
-              <w:spacing w:after="20" w:line="240" w:lineRule="auto"/>
+              <w:spacing w:after="20"/>
             </w:pPr>
             <w:r>
               <w:rPr>
@@ -2322,7 +2294,7 @@
           </w:tcPr>
           <w:p>
             <w:pPr>
-              <w:spacing w:after="20" w:line="240" w:lineRule="auto"/>
+              <w:spacing w:after="20"/>
             </w:pPr>
             <w:r>
               <w:rPr>
@@ -2343,7 +2315,7 @@
           </w:tcPr>
           <w:p>
             <w:pPr>
-              <w:spacing w:after="20" w:line="240" w:lineRule="auto"/>
+              <w:spacing w:after="20"/>
             </w:pPr>
             <w:r>
               <w:rPr>
@@ -2359,7 +2331,7 @@
           </w:tcPr>
           <w:p>
             <w:pPr>
-              <w:spacing w:after="20" w:line="240" w:lineRule="auto"/>
+              <w:spacing w:after="20"/>
             </w:pPr>
             <w:r>
               <w:rPr>
@@ -2375,7 +2347,7 @@
           </w:tcPr>
           <w:p>
             <w:pPr>
-              <w:spacing w:after="20" w:line="240" w:lineRule="auto"/>
+              <w:spacing w:after="20"/>
             </w:pPr>
             <w:r>
               <w:rPr>
@@ -2488,7 +2460,7 @@
           </w:tcPr>
           <w:p>
             <w:pPr>
-              <w:spacing w:after="20" w:line="240" w:lineRule="auto"/>
+              <w:spacing w:after="20"/>
             </w:pPr>
             <w:r>
               <w:rPr>
@@ -2506,7 +2478,7 @@
           </w:tcPr>
           <w:p>
             <w:pPr>
-              <w:spacing w:after="20" w:line="240" w:lineRule="auto"/>
+              <w:spacing w:after="20"/>
             </w:pPr>
             <w:r>
               <w:rPr>
@@ -2531,7 +2503,7 @@
           </w:tcPr>
           <w:p>
             <w:pPr>
-              <w:spacing w:after="20" w:line="240" w:lineRule="auto"/>
+              <w:spacing w:after="20"/>
             </w:pPr>
             <w:r>
               <w:rPr>
@@ -2554,7 +2526,7 @@
           </w:tcPr>
           <w:p>
             <w:pPr>
-              <w:spacing w:after="20" w:line="240" w:lineRule="auto"/>
+              <w:spacing w:after="20"/>
             </w:pPr>
             <w:r>
               <w:rPr>
@@ -2570,7 +2542,7 @@
           </w:tcPr>
           <w:p>
             <w:pPr>
-              <w:spacing w:after="20" w:line="240" w:lineRule="auto"/>
+              <w:spacing w:after="20"/>
             </w:pPr>
             <w:r>
               <w:rPr>
@@ -2586,7 +2558,7 @@
           </w:tcPr>
           <w:p>
             <w:pPr>
-              <w:spacing w:after="20" w:line="240" w:lineRule="auto"/>
+              <w:spacing w:after="20"/>
             </w:pPr>
             <w:r>
               <w:rPr>
@@ -2608,7 +2580,7 @@
           </w:tcPr>
           <w:p>
             <w:pPr>
-              <w:spacing w:after="20" w:line="240" w:lineRule="auto"/>
+              <w:spacing w:after="20"/>
             </w:pPr>
             <w:r>
               <w:rPr>
@@ -2624,7 +2596,7 @@
           </w:tcPr>
           <w:p>
             <w:pPr>
-              <w:spacing w:after="20" w:line="240" w:lineRule="auto"/>
+              <w:spacing w:after="20"/>
             </w:pPr>
             <w:r>
               <w:rPr>
@@ -2640,7 +2612,7 @@
           </w:tcPr>
           <w:p>
             <w:pPr>
-              <w:spacing w:after="20" w:line="240" w:lineRule="auto"/>
+              <w:spacing w:after="20"/>
             </w:pPr>
             <w:r>
               <w:rPr>
@@ -2662,7 +2634,7 @@
           </w:tcPr>
           <w:p>
             <w:pPr>
-              <w:spacing w:after="20" w:line="240" w:lineRule="auto"/>
+              <w:spacing w:after="20"/>
             </w:pPr>
             <w:r>
               <w:rPr>
@@ -2678,7 +2650,7 @@
           </w:tcPr>
           <w:p>
             <w:pPr>
-              <w:spacing w:after="20" w:line="240" w:lineRule="auto"/>
+              <w:spacing w:after="20"/>
             </w:pPr>
             <w:r>
               <w:rPr>
@@ -2694,7 +2666,7 @@
           </w:tcPr>
           <w:p>
             <w:pPr>
-              <w:spacing w:after="20" w:line="240" w:lineRule="auto"/>
+              <w:spacing w:after="20"/>
             </w:pPr>
             <w:r>
               <w:rPr>
@@ -2716,7 +2688,7 @@
           </w:tcPr>
           <w:p>
             <w:pPr>
-              <w:spacing w:after="20" w:line="240" w:lineRule="auto"/>
+              <w:spacing w:after="20"/>
             </w:pPr>
             <w:r>
               <w:rPr>
@@ -2732,7 +2704,7 @@
           </w:tcPr>
           <w:p>
             <w:pPr>
-              <w:spacing w:after="20" w:line="240" w:lineRule="auto"/>
+              <w:spacing w:after="20"/>
             </w:pPr>
             <w:r>
               <w:rPr>
@@ -2748,7 +2720,7 @@
           </w:tcPr>
           <w:p>
             <w:pPr>
-              <w:spacing w:after="20" w:line="240" w:lineRule="auto"/>
+              <w:spacing w:after="20"/>
             </w:pPr>
             <w:r>
               <w:rPr>
@@ -2770,7 +2742,7 @@
           </w:tcPr>
           <w:p>
             <w:pPr>
-              <w:spacing w:after="20" w:line="240" w:lineRule="auto"/>
+              <w:spacing w:after="20"/>
             </w:pPr>
             <w:r>
               <w:rPr>
@@ -2786,7 +2758,7 @@
           </w:tcPr>
           <w:p>
             <w:pPr>
-              <w:spacing w:after="20" w:line="240" w:lineRule="auto"/>
+              <w:spacing w:after="20"/>
             </w:pPr>
             <w:r>
               <w:rPr>
@@ -2802,7 +2774,7 @@
           </w:tcPr>
           <w:p>
             <w:pPr>
-              <w:spacing w:after="20" w:line="240" w:lineRule="auto"/>
+              <w:spacing w:after="20"/>
             </w:pPr>
             <w:r>
               <w:rPr>
@@ -2824,7 +2796,7 @@
           </w:tcPr>
           <w:p>
             <w:pPr>
-              <w:spacing w:after="20" w:line="240" w:lineRule="auto"/>
+              <w:spacing w:after="20"/>
             </w:pPr>
             <w:r>
               <w:rPr>
@@ -2840,7 +2812,7 @@
           </w:tcPr>
           <w:p>
             <w:pPr>
-              <w:spacing w:after="20" w:line="240" w:lineRule="auto"/>
+              <w:spacing w:after="20"/>
             </w:pPr>
             <w:r>
               <w:rPr>
@@ -2856,7 +2828,7 @@
           </w:tcPr>
           <w:p>
             <w:pPr>
-              <w:spacing w:after="20" w:line="240" w:lineRule="auto"/>
+              <w:spacing w:after="20"/>
             </w:pPr>
             <w:r>
               <w:rPr>
@@ -2878,7 +2850,7 @@
           </w:tcPr>
           <w:p>
             <w:pPr>
-              <w:spacing w:after="20" w:line="240" w:lineRule="auto"/>
+              <w:spacing w:after="20"/>
             </w:pPr>
             <w:r>
               <w:rPr>
@@ -2894,7 +2866,7 @@
           </w:tcPr>
           <w:p>
             <w:pPr>
-              <w:spacing w:after="20" w:line="240" w:lineRule="auto"/>
+              <w:spacing w:after="20"/>
             </w:pPr>
             <w:r>
               <w:rPr>
@@ -2910,7 +2882,7 @@
           </w:tcPr>
           <w:p>
             <w:pPr>
-              <w:spacing w:after="20" w:line="240" w:lineRule="auto"/>
+              <w:spacing w:after="20"/>
             </w:pPr>
             <w:r>
               <w:rPr>
@@ -2932,7 +2904,7 @@
           </w:tcPr>
           <w:p>
             <w:pPr>
-              <w:spacing w:after="20" w:line="240" w:lineRule="auto"/>
+              <w:spacing w:after="20"/>
             </w:pPr>
             <w:r>
               <w:rPr>
@@ -2948,7 +2920,7 @@
           </w:tcPr>
           <w:p>
             <w:pPr>
-              <w:spacing w:after="20" w:line="240" w:lineRule="auto"/>
+              <w:spacing w:after="20"/>
             </w:pPr>
             <w:r>
               <w:rPr>
@@ -2964,7 +2936,7 @@
           </w:tcPr>
           <w:p>
             <w:pPr>
-              <w:spacing w:after="20" w:line="240" w:lineRule="auto"/>
+              <w:spacing w:after="20"/>
             </w:pPr>
             <w:r>
               <w:rPr>
@@ -2986,7 +2958,7 @@
           </w:tcPr>
           <w:p>
             <w:pPr>
-              <w:spacing w:after="20" w:line="240" w:lineRule="auto"/>
+              <w:spacing w:after="20"/>
             </w:pPr>
             <w:r>
               <w:rPr>
@@ -3002,7 +2974,7 @@
           </w:tcPr>
           <w:p>
             <w:pPr>
-              <w:spacing w:after="20" w:line="240" w:lineRule="auto"/>
+              <w:spacing w:after="20"/>
             </w:pPr>
             <w:r>
               <w:rPr>
@@ -3018,7 +2990,7 @@
           </w:tcPr>
           <w:p>
             <w:pPr>
-              <w:spacing w:after="20" w:line="240" w:lineRule="auto"/>
+              <w:spacing w:after="20"/>
             </w:pPr>
             <w:r>
               <w:rPr>
@@ -3301,7 +3273,7 @@
           </w:tcPr>
           <w:p>
             <w:pPr>
-              <w:spacing w:after="20" w:line="240" w:lineRule="auto"/>
+              <w:spacing w:after="20"/>
             </w:pPr>
             <w:r>
               <w:rPr>
@@ -3319,7 +3291,7 @@
           </w:tcPr>
           <w:p>
             <w:pPr>
-              <w:spacing w:after="20" w:line="240" w:lineRule="auto"/>
+              <w:spacing w:after="20"/>
             </w:pPr>
             <w:r>
               <w:rPr>
@@ -3337,7 +3309,7 @@
           </w:tcPr>
           <w:p>
             <w:pPr>
-              <w:spacing w:after="20" w:line="240" w:lineRule="auto"/>
+              <w:spacing w:after="20"/>
             </w:pPr>
             <w:r>
               <w:rPr>
@@ -3359,7 +3331,7 @@
           </w:tcPr>
           <w:p>
             <w:pPr>
-              <w:spacing w:after="20" w:line="240" w:lineRule="auto"/>
+              <w:spacing w:after="20"/>
             </w:pPr>
             <w:r>
               <w:rPr>
@@ -3375,7 +3347,7 @@
           </w:tcPr>
           <w:p>
             <w:pPr>
-              <w:spacing w:after="20" w:line="240" w:lineRule="auto"/>
+              <w:spacing w:after="20"/>
             </w:pPr>
             <w:r>
               <w:rPr>
@@ -3391,7 +3363,7 @@
           </w:tcPr>
           <w:p>
             <w:pPr>
-              <w:spacing w:after="20" w:line="240" w:lineRule="auto"/>
+              <w:spacing w:after="20"/>
             </w:pPr>
             <w:r>
               <w:rPr>
@@ -3412,7 +3384,7 @@
           </w:tcPr>
           <w:p>
             <w:pPr>
-              <w:spacing w:after="20" w:line="240" w:lineRule="auto"/>
+              <w:spacing w:after="20"/>
             </w:pPr>
             <w:r>
               <w:rPr>
@@ -3428,7 +3400,7 @@
           </w:tcPr>
           <w:p>
             <w:pPr>
-              <w:spacing w:after="20" w:line="240" w:lineRule="auto"/>
+              <w:spacing w:after="20"/>
             </w:pPr>
             <w:r>
               <w:rPr>
@@ -3456,7 +3428,7 @@
           </w:tcPr>
           <w:p>
             <w:pPr>
-              <w:spacing w:after="20" w:line="240" w:lineRule="auto"/>
+              <w:spacing w:after="20"/>
             </w:pPr>
             <w:r>
               <w:rPr>
@@ -3477,7 +3449,7 @@
           </w:tcPr>
           <w:p>
             <w:pPr>
-              <w:spacing w:after="20" w:line="240" w:lineRule="auto"/>
+              <w:spacing w:after="20"/>
             </w:pPr>
             <w:r>
               <w:rPr>
@@ -3493,7 +3465,7 @@
           </w:tcPr>
           <w:p>
             <w:pPr>
-              <w:spacing w:after="20" w:line="240" w:lineRule="auto"/>
+              <w:spacing w:after="20"/>
             </w:pPr>
             <w:r>
               <w:rPr>
@@ -3509,7 +3481,7 @@
           </w:tcPr>
           <w:p>
             <w:pPr>
-              <w:spacing w:after="20" w:line="240" w:lineRule="auto"/>
+              <w:spacing w:after="20"/>
             </w:pPr>
             <w:r>
               <w:rPr>
@@ -3530,7 +3502,7 @@
           </w:tcPr>
           <w:p>
             <w:pPr>
-              <w:spacing w:after="20" w:line="240" w:lineRule="auto"/>
+              <w:spacing w:after="20"/>
             </w:pPr>
             <w:r>
               <w:rPr>
@@ -3546,7 +3518,7 @@
           </w:tcPr>
           <w:p>
             <w:pPr>
-              <w:spacing w:after="20" w:line="240" w:lineRule="auto"/>
+              <w:spacing w:after="20"/>
             </w:pPr>
             <w:r>
               <w:rPr>
@@ -3562,7 +3534,7 @@
           </w:tcPr>
           <w:p>
             <w:pPr>
-              <w:spacing w:after="20" w:line="240" w:lineRule="auto"/>
+              <w:spacing w:after="20"/>
             </w:pPr>
             <w:r>
               <w:rPr>
@@ -3583,7 +3555,7 @@
           </w:tcPr>
           <w:p>
             <w:pPr>
-              <w:spacing w:after="20" w:line="240" w:lineRule="auto"/>
+              <w:spacing w:after="20"/>
             </w:pPr>
             <w:r>
               <w:rPr>
@@ -3599,7 +3571,7 @@
           </w:tcPr>
           <w:p>
             <w:pPr>
-              <w:spacing w:after="20" w:line="240" w:lineRule="auto"/>
+              <w:spacing w:after="20"/>
             </w:pPr>
             <w:r>
               <w:rPr>
@@ -3615,7 +3587,7 @@
           </w:tcPr>
           <w:p>
             <w:pPr>
-              <w:spacing w:after="20" w:line="240" w:lineRule="auto"/>
+              <w:spacing w:after="20"/>
             </w:pPr>
             <w:r>
               <w:rPr>
@@ -3636,7 +3608,7 @@
           </w:tcPr>
           <w:p>
             <w:pPr>
-              <w:spacing w:after="20" w:line="240" w:lineRule="auto"/>
+              <w:spacing w:after="20"/>
             </w:pPr>
             <w:r>
               <w:rPr>
@@ -3652,7 +3624,7 @@
           </w:tcPr>
           <w:p>
             <w:pPr>
-              <w:spacing w:after="20" w:line="240" w:lineRule="auto"/>
+              <w:spacing w:after="20"/>
             </w:pPr>
             <w:r>
               <w:rPr>
@@ -3668,7 +3640,7 @@
           </w:tcPr>
           <w:p>
             <w:pPr>
-              <w:spacing w:after="20" w:line="240" w:lineRule="auto"/>
+              <w:spacing w:after="20"/>
             </w:pPr>
             <w:r>
               <w:rPr>
@@ -3689,7 +3661,7 @@
           </w:tcPr>
           <w:p>
             <w:pPr>
-              <w:spacing w:after="20" w:line="240" w:lineRule="auto"/>
+              <w:spacing w:after="20"/>
             </w:pPr>
             <w:r>
               <w:rPr>
@@ -3705,7 +3677,7 @@
           </w:tcPr>
           <w:p>
             <w:pPr>
-              <w:spacing w:after="20" w:line="240" w:lineRule="auto"/>
+              <w:spacing w:after="20"/>
             </w:pPr>
             <w:r>
               <w:rPr>
@@ -3721,7 +3693,7 @@
           </w:tcPr>
           <w:p>
             <w:pPr>
-              <w:spacing w:after="20" w:line="240" w:lineRule="auto"/>
+              <w:spacing w:after="20"/>
             </w:pPr>
             <w:r>
               <w:rPr>
@@ -3742,7 +3714,7 @@
           </w:tcPr>
           <w:p>
             <w:pPr>
-              <w:spacing w:after="20" w:line="240" w:lineRule="auto"/>
+              <w:spacing w:after="20"/>
             </w:pPr>
             <w:r>
               <w:rPr>
@@ -3758,7 +3730,7 @@
           </w:tcPr>
           <w:p>
             <w:pPr>
-              <w:spacing w:after="20" w:line="240" w:lineRule="auto"/>
+              <w:spacing w:after="20"/>
             </w:pPr>
             <w:r>
               <w:rPr>
@@ -3774,7 +3746,7 @@
           </w:tcPr>
           <w:p>
             <w:pPr>
-              <w:spacing w:after="20" w:line="240" w:lineRule="auto"/>
+              <w:spacing w:after="20"/>
             </w:pPr>
             <w:r>
               <w:rPr>
@@ -3838,7 +3810,7 @@
           </w:tcPr>
           <w:p>
             <w:pPr>
-              <w:spacing w:after="20" w:line="240" w:lineRule="auto"/>
+              <w:spacing w:after="20"/>
             </w:pPr>
             <w:r>
               <w:rPr>
@@ -3857,7 +3829,7 @@
           </w:tcPr>
           <w:p>
             <w:pPr>
-              <w:spacing w:after="20" w:line="240" w:lineRule="auto"/>
+              <w:spacing w:after="20"/>
             </w:pPr>
             <w:r>
               <w:rPr>
@@ -3879,7 +3851,7 @@
           </w:tcPr>
           <w:p>
             <w:pPr>
-              <w:spacing w:after="20" w:line="240" w:lineRule="auto"/>
+              <w:spacing w:after="20"/>
             </w:pPr>
             <w:r>
               <w:rPr>
@@ -3895,7 +3867,7 @@
           </w:tcPr>
           <w:p>
             <w:pPr>
-              <w:spacing w:after="20" w:line="240" w:lineRule="auto"/>
+              <w:spacing w:after="20"/>
             </w:pPr>
             <w:r>
               <w:rPr>
@@ -3916,7 +3888,7 @@
           </w:tcPr>
           <w:p>
             <w:pPr>
-              <w:spacing w:after="20" w:line="240" w:lineRule="auto"/>
+              <w:spacing w:after="20"/>
             </w:pPr>
             <w:r>
               <w:rPr>
@@ -3932,7 +3904,7 @@
           </w:tcPr>
           <w:p>
             <w:pPr>
-              <w:spacing w:after="20" w:line="240" w:lineRule="auto"/>
+              <w:spacing w:after="20"/>
             </w:pPr>
             <w:r>
               <w:rPr>
@@ -3953,7 +3925,7 @@
           </w:tcPr>
           <w:p>
             <w:pPr>
-              <w:spacing w:after="20" w:line="240" w:lineRule="auto"/>
+              <w:spacing w:after="20"/>
             </w:pPr>
             <w:r>
               <w:rPr>
@@ -3969,7 +3941,7 @@
           </w:tcPr>
           <w:p>
             <w:pPr>
-              <w:spacing w:after="20" w:line="240" w:lineRule="auto"/>
+              <w:spacing w:after="20"/>
             </w:pPr>
             <w:r>
               <w:rPr>
@@ -3990,7 +3962,7 @@
           </w:tcPr>
           <w:p>
             <w:pPr>
-              <w:spacing w:after="20" w:line="240" w:lineRule="auto"/>
+              <w:spacing w:after="20"/>
             </w:pPr>
             <w:r>
               <w:rPr>
@@ -4006,7 +3978,7 @@
           </w:tcPr>
           <w:p>
             <w:pPr>
-              <w:spacing w:after="20" w:line="240" w:lineRule="auto"/>
+              <w:spacing w:after="20"/>
             </w:pPr>
             <w:r>
               <w:rPr>
@@ -4027,7 +3999,7 @@
           </w:tcPr>
           <w:p>
             <w:pPr>
-              <w:spacing w:after="20" w:line="240" w:lineRule="auto"/>
+              <w:spacing w:after="20"/>
             </w:pPr>
             <w:r>
               <w:rPr>
@@ -4043,7 +4015,7 @@
           </w:tcPr>
           <w:p>
             <w:pPr>
-              <w:spacing w:after="20" w:line="240" w:lineRule="auto"/>
+              <w:spacing w:after="20"/>
             </w:pPr>
             <w:r>
               <w:rPr>
@@ -4108,7 +4080,7 @@
           </w:tcPr>
           <w:p>
             <w:pPr>
-              <w:spacing w:after="20" w:line="240" w:lineRule="auto"/>
+              <w:spacing w:after="20"/>
             </w:pPr>
             <w:r>
               <w:rPr>
@@ -4126,7 +4098,7 @@
           </w:tcPr>
           <w:p>
             <w:pPr>
-              <w:spacing w:after="20" w:line="240" w:lineRule="auto"/>
+              <w:spacing w:after="20"/>
             </w:pPr>
             <w:r>
               <w:rPr>
@@ -4144,7 +4116,7 @@
           </w:tcPr>
           <w:p>
             <w:pPr>
-              <w:spacing w:after="20" w:line="240" w:lineRule="auto"/>
+              <w:spacing w:after="20"/>
             </w:pPr>
             <w:r>
               <w:rPr>
@@ -4166,7 +4138,7 @@
           </w:tcPr>
           <w:p>
             <w:pPr>
-              <w:spacing w:after="20" w:line="240" w:lineRule="auto"/>
+              <w:spacing w:after="20"/>
             </w:pPr>
             <w:r>
               <w:rPr>
@@ -4182,7 +4154,7 @@
           </w:tcPr>
           <w:p>
             <w:pPr>
-              <w:spacing w:after="20" w:line="240" w:lineRule="auto"/>
+              <w:spacing w:after="20"/>
             </w:pPr>
             <w:r>
               <w:rPr>
@@ -4198,7 +4170,7 @@
           </w:tcPr>
           <w:p>
             <w:pPr>
-              <w:spacing w:after="20" w:line="240" w:lineRule="auto"/>
+              <w:spacing w:after="20"/>
             </w:pPr>
             <w:r>
               <w:rPr>
@@ -4219,7 +4191,7 @@
           </w:tcPr>
           <w:p>
             <w:pPr>
-              <w:spacing w:after="20" w:line="240" w:lineRule="auto"/>
+              <w:spacing w:after="20"/>
             </w:pPr>
             <w:r>
               <w:rPr>
@@ -4235,7 +4207,7 @@
           </w:tcPr>
           <w:p>
             <w:pPr>
-              <w:spacing w:after="20" w:line="240" w:lineRule="auto"/>
+              <w:spacing w:after="20"/>
             </w:pPr>
             <w:r>
               <w:rPr>
@@ -4251,7 +4223,7 @@
           </w:tcPr>
           <w:p>
             <w:pPr>
-              <w:spacing w:after="20" w:line="240" w:lineRule="auto"/>
+              <w:spacing w:after="20"/>
             </w:pPr>
             <w:r>
               <w:rPr>
@@ -4272,7 +4244,7 @@
           </w:tcPr>
           <w:p>
             <w:pPr>
-              <w:spacing w:after="20" w:line="240" w:lineRule="auto"/>
+              <w:spacing w:after="20"/>
             </w:pPr>
             <w:r>
               <w:rPr>
@@ -4288,7 +4260,7 @@
           </w:tcPr>
           <w:p>
             <w:pPr>
-              <w:spacing w:after="20" w:line="240" w:lineRule="auto"/>
+              <w:spacing w:after="20"/>
             </w:pPr>
             <w:r>
               <w:rPr>
@@ -4304,7 +4276,7 @@
           </w:tcPr>
           <w:p>
             <w:pPr>
-              <w:spacing w:after="20" w:line="240" w:lineRule="auto"/>
+              <w:spacing w:after="20"/>
             </w:pPr>
             <w:r>
               <w:rPr>
@@ -4325,7 +4297,7 @@
           </w:tcPr>
           <w:p>
             <w:pPr>
-              <w:spacing w:after="20" w:line="240" w:lineRule="auto"/>
+              <w:spacing w:after="20"/>
             </w:pPr>
             <w:r>
               <w:rPr>
@@ -4341,7 +4313,7 @@
           </w:tcPr>
           <w:p>
             <w:pPr>
-              <w:spacing w:after="20" w:line="240" w:lineRule="auto"/>
+              <w:spacing w:after="20"/>
             </w:pPr>
             <w:r>
               <w:rPr>
@@ -4357,7 +4329,7 @@
           </w:tcPr>
           <w:p>
             <w:pPr>
-              <w:spacing w:after="20" w:line="240" w:lineRule="auto"/>
+              <w:spacing w:after="20"/>
             </w:pPr>
             <w:r>
               <w:rPr>
@@ -4378,7 +4350,7 @@
           </w:tcPr>
           <w:p>
             <w:pPr>
-              <w:spacing w:after="20" w:line="240" w:lineRule="auto"/>
+              <w:spacing w:after="20"/>
             </w:pPr>
             <w:r>
               <w:rPr>
@@ -4394,7 +4366,7 @@
           </w:tcPr>
           <w:p>
             <w:pPr>
-              <w:spacing w:after="20" w:line="240" w:lineRule="auto"/>
+              <w:spacing w:after="20"/>
             </w:pPr>
             <w:r>
               <w:rPr>
@@ -4410,7 +4382,7 @@
           </w:tcPr>
           <w:p>
             <w:pPr>
-              <w:spacing w:after="20" w:line="240" w:lineRule="auto"/>
+              <w:spacing w:after="20"/>
             </w:pPr>
             <w:r>
               <w:rPr>
@@ -4433,22 +4405,6 @@
       </w:pPr>
       <w:r>
         <w:t>In every table, each determinant is a candidate key, so there are no partial or transitive dependencies.</w:t>
-      </w:r>
-    </w:p>
-    <w:p>
-      <w:pPr>
-        <w:pStyle w:val="Heading2"/>
-      </w:pPr>
-      <w:r>
-        <w:t>6.3 Plan for Review II and III</w:t>
-      </w:r>
-    </w:p>
-    <w:p>
-      <w:pPr>
-        <w:jc w:val="both"/>
-      </w:pPr>
-      <w:r>
-        <w:t>The schema already has a place for each component the guidelines ask for: views for the reports above; functions for stock on hand and board cost; procedures to record a purchase and complete a build; a cursor that walks through a build's shortfall to produce a shopping list; and triggers that stop stock from going negative and stop a build from being completed without enough parts. The Python front end will call these directly.</w:t>
       </w:r>
     </w:p>
     <w:sectPr>
@@ -5384,6 +5340,7 @@
   <w:style w:type="character" w:default="1" w:styleId="DefaultParagraphFont">
     <w:name w:val="Default Paragraph Font"/>
     <w:uiPriority w:val="1"/>
+    <w:semiHidden/>
     <w:unhideWhenUsed/>
   </w:style>
   <w:style w:type="table" w:default="1" w:styleId="TableNormal">

</xml_diff>